<commit_message>
fix: Bug ao tentar identificar os campos da mensagem do whatsapp corrigido. Agora o sistema atende a regra campo Valor e não somente campo : Valor
</commit_message>
<xml_diff>
--- a/templates/farmacia/modelo_plano_farmacia_automatizado.docx
+++ b/templates/farmacia/modelo_plano_farmacia_automatizado.docx
@@ -2062,6 +2062,13 @@
         </w:rPr>
         <w:t>{{SIGLA_CONSELHO_RT}}</w:t>
       </w:r>
+      <w:r>
+        <w:rPr>
+          <w:b w:val="0"/>
+          <w:bCs w:val="0"/>
+        </w:rPr>
+        <w:t xml:space="preserve"> {{NUMERO_CONSELHO_RT}}</w:t>
+      </w:r>
     </w:p>
     <w:p>
       <w:pPr>
@@ -2092,7 +2099,6 @@
         </w:rPr>
         <w:t xml:space="preserve">E-mail </w:t>
       </w:r>
-      <w:proofErr w:type="gramStart"/>
       <w:r>
         <w:rPr>
           <w:lang w:val="en-US"/>
@@ -2107,7 +2113,6 @@
         </w:rPr>
         <w:t>{{</w:t>
       </w:r>
-      <w:proofErr w:type="gramEnd"/>
       <w:r>
         <w:rPr>
           <w:b w:val="0"/>
@@ -3951,6 +3956,14 @@
         </w:rPr>
         <w:t>{{CONSELHO_RT_DOCUMENTO}}</w:t>
       </w:r>
+      <w:r>
+        <w:rPr>
+          <w:bCs/>
+          <w:sz w:val="24"/>
+          <w:szCs w:val="24"/>
+        </w:rPr>
+        <w:t xml:space="preserve"> {{NUMERO_CONSELHO_RT}}</w:t>
+      </w:r>
     </w:p>
     <w:p>
       <w:pPr>
@@ -4014,7 +4027,34 @@
           <w:sz w:val="24"/>
           <w:szCs w:val="24"/>
         </w:rPr>
-        <w:t>{{DATA_FIM}}</w:t>
+        <w:t>{{DATA_</w:t>
+      </w:r>
+      <w:r>
+        <w:rPr>
+          <w:bCs/>
+          <w:spacing w:val="-2"/>
+          <w:sz w:val="24"/>
+          <w:szCs w:val="24"/>
+        </w:rPr>
+        <w:t>INICIO</w:t>
+      </w:r>
+      <w:r>
+        <w:rPr>
+          <w:bCs/>
+          <w:spacing w:val="-2"/>
+          <w:sz w:val="24"/>
+          <w:szCs w:val="24"/>
+        </w:rPr>
+        <w:t>_ESTAGIO</w:t>
+      </w:r>
+      <w:r>
+        <w:rPr>
+          <w:bCs/>
+          <w:spacing w:val="-2"/>
+          <w:sz w:val="24"/>
+          <w:szCs w:val="24"/>
+        </w:rPr>
+        <w:t>}}</w:t>
       </w:r>
     </w:p>
     <w:p>

</xml_diff>